<commit_message>
Fix: identify the Battlespire-banishing weapon as Mehrunes' Razor
Corrected an unresolved-name caveat in The Red Legions -- the artifact
was Mehrunes' Razor itself, not a separate, unidentified sword. Now ties
its first recorded use directly to the author's own Battlespire account.

Co-Authored-By: Claude Sonnet 5 <noreply@anthropic.com>
</commit_message>
<xml_diff>
--- a/Lore Books/The Red Legions.docx
+++ b/Lore Books/The Red Legions.docx
@@ -639,17 +639,16 @@
     </w:p>
     <w:p>
       <w:pPr>
-        <w:spacing w:before="80" w:after="160"/>
-        <w:ind w:left="576" w:right="576"/>
+        <w:spacing w:after="160"/>
       </w:pPr>
       <w:r>
         <w:rPr>
           <w:rFonts w:ascii="Cambria" w:hAnsi="Cambria"/>
-          <w:i/>
-          <w:color w:val="5C5650"/>
-          <w:sz w:val="21"/>
+          <w:i w:val="0"/>
+          <w:color w:val="1D1B1A"/>
+          <w:sz w:val="22"/>
         </w:rPr>
-        <w:t>One further weapon is attributed to him in the older accounts I hold, under a name I do not trust my own sources to render correctly -- I have seen it given as something like a sword named for a moon-touched river, though I suspect that is a corruption of an older and more accurate name I have not been able to recover. I record its existence and its reputed power -- strong enough, by the account, to have banished the Prince himself from a battlefield once -- and decline to commit to a spelling I cannot verify. A cadet who finds better sources than mine should correct this entry, not trust it.</w:t>
+        <w:t>The instrument that ended his invasion of this very college has since become known to every cadet under a different reputation entirely: Mehrunes' Razor, the same dagger the theological texts describe at length for its place in Camoran's doctrine of soul-carving. Before it was any of that to anyone, it was simply the blade that drove the Prince out of this hall. I set the fact down here because the cadets who study the Razor in the commentaries rarely learn that its first recorded use, at least in any account I trust, was against the very institution now teaching them its later history.</w:t>
       </w:r>
     </w:p>
     <w:p>

</xml_diff>